<commit_message>
create login and signup pages
</commit_message>
<xml_diff>
--- a/TDL.docx
+++ b/TDL.docx
@@ -586,7 +586,6 @@
     <w:p>
       <w:pPr>
         <w:rPr>
-          <w:rFonts w:hint="cs"/>
           <w:rtl/>
           <w:lang w:val="en-US"/>
         </w:rPr>
@@ -717,13 +716,7 @@
         <w:rPr>
           <w:highlight w:val="cyan"/>
         </w:rPr>
-        <w:t>Components</w:t>
-      </w:r>
-      <w:r>
-        <w:rPr>
-          <w:highlight w:val="cyan"/>
-        </w:rPr>
-        <w:t>:</w:t>
+        <w:t>Components:</w:t>
       </w:r>
     </w:p>
     <w:p>
@@ -742,7 +735,6 @@
     <w:p>
       <w:pPr>
         <w:rPr>
-          <w:rFonts w:hint="cs"/>
           <w:highlight w:val="green"/>
           <w:rtl/>
           <w:lang w:val="ru-RU"/>
@@ -1198,15 +1190,22 @@
       </w:pPr>
       <w:r>
         <w:rPr>
+          <w:highlight w:val="green"/>
           <w:lang w:val="en-US"/>
         </w:rPr>
         <w:t>create Landing page – logo + css + navigation buttons</w:t>
       </w:r>
     </w:p>
     <w:p>
-      <w:pPr>
-        <w:rPr>
-          <w:lang w:val="en-US"/>
+      <w:r>
+        <w:t xml:space="preserve">create logo + name </w:t>
+      </w:r>
+    </w:p>
+    <w:p>
+      <w:pPr>
+        <w:rPr>
+          <w:rFonts w:hint="cs"/>
+          <w:rtl/>
         </w:rPr>
       </w:pPr>
     </w:p>
@@ -1327,11 +1326,13 @@
     <w:p>
       <w:pPr>
         <w:rPr>
-          <w:lang w:val="en-US"/>
-        </w:rPr>
-      </w:pPr>
-      <w:r>
-        <w:rPr>
+          <w:highlight w:val="green"/>
+          <w:lang w:val="en-US"/>
+        </w:rPr>
+      </w:pPr>
+      <w:r>
+        <w:rPr>
+          <w:highlight w:val="green"/>
           <w:lang w:val="en-US"/>
         </w:rPr>
         <w:t>create Login page - after login continue to dashboard</w:t>
@@ -1345,6 +1346,7 @@
       </w:pPr>
       <w:r>
         <w:rPr>
+          <w:highlight w:val="green"/>
           <w:lang w:val="en-US"/>
         </w:rPr>
         <w:t>create Register page - after register continue to login</w:t>
@@ -1375,7 +1377,6 @@
     <w:p>
       <w:pPr>
         <w:rPr>
-          <w:rFonts w:hint="cs"/>
           <w:rtl/>
           <w:lang w:val="ru-RU"/>
         </w:rPr>

</xml_diff>

<commit_message>
add login and signup routes to server, add error handling to signup page
</commit_message>
<xml_diff>
--- a/TDL.docx
+++ b/TDL.docx
@@ -1198,190 +1198,294 @@
     </w:p>
     <w:p>
       <w:r>
-        <w:t xml:space="preserve">create logo + name </w:t>
-      </w:r>
-    </w:p>
-    <w:p>
-      <w:pPr>
+        <w:rPr>
+          <w:highlight w:val="red"/>
+        </w:rPr>
+        <w:t>create logo + name</w:t>
+      </w:r>
+      <w:r>
+        <w:t xml:space="preserve"> </w:t>
+      </w:r>
+    </w:p>
+    <w:p>
+      <w:pPr>
+        <w:rPr>
+          <w:rtl/>
+        </w:rPr>
+      </w:pPr>
+    </w:p>
+    <w:p>
+      <w:pPr>
+        <w:rPr>
+          <w:lang w:val="en-US"/>
+        </w:rPr>
+      </w:pPr>
+      <w:r>
+        <w:rPr>
+          <w:lang w:val="en-US"/>
+        </w:rPr>
+        <w:t>2.</w:t>
+      </w:r>
+      <w:r>
+        <w:rPr>
+          <w:b/>
+          <w:bCs/>
+          <w:lang w:val="en-US"/>
+        </w:rPr>
+        <w:t>server side:</w:t>
+      </w:r>
+      <w:r>
+        <w:rPr>
+          <w:lang w:val="en-US"/>
+        </w:rPr>
+        <w:t xml:space="preserve"> </w:t>
+      </w:r>
+    </w:p>
+    <w:p>
+      <w:pPr>
+        <w:rPr>
+          <w:highlight w:val="green"/>
+          <w:rtl/>
+          <w:lang w:val="en-US"/>
+        </w:rPr>
+      </w:pPr>
+      <w:r>
+        <w:rPr>
+          <w:highlight w:val="green"/>
+          <w:lang w:val="en-US"/>
+        </w:rPr>
+        <w:t xml:space="preserve">routes: </w:t>
+      </w:r>
+    </w:p>
+    <w:p>
+      <w:pPr>
+        <w:rPr>
+          <w:highlight w:val="green"/>
+          <w:rtl/>
+          <w:lang w:val="en-US"/>
+        </w:rPr>
+      </w:pPr>
+      <w:r>
+        <w:rPr>
+          <w:highlight w:val="green"/>
+          <w:lang w:val="en-US"/>
+        </w:rPr>
+        <w:t>register function (</w:t>
+      </w:r>
+      <w:r>
+        <w:rPr>
+          <w:highlight w:val="green"/>
+          <w:lang w:val="en-US"/>
+        </w:rPr>
+        <w:t xml:space="preserve">save </w:t>
+      </w:r>
+      <w:r>
+        <w:rPr>
+          <w:highlight w:val="green"/>
+          <w:lang w:val="en-US"/>
+        </w:rPr>
+        <w:t xml:space="preserve">with encryption) </w:t>
+      </w:r>
+    </w:p>
+    <w:p>
+      <w:pPr>
+        <w:rPr>
+          <w:lang w:val="en-US"/>
+        </w:rPr>
+      </w:pPr>
+      <w:r>
+        <w:rPr>
+          <w:highlight w:val="green"/>
+          <w:lang w:val="en-US"/>
+        </w:rPr>
+        <w:t>login function (checks db if exists + check password)</w:t>
+      </w:r>
+    </w:p>
+    <w:p>
+      <w:pPr>
+        <w:rPr>
+          <w:lang w:val="en-US"/>
+        </w:rPr>
+      </w:pPr>
+    </w:p>
+    <w:p>
+      <w:pPr>
+        <w:rPr>
+          <w:lang w:val="en-US"/>
+        </w:rPr>
+      </w:pPr>
+      <w:r>
+        <w:rPr>
+          <w:lang w:val="en-US"/>
+        </w:rPr>
+        <w:t>3.</w:t>
+      </w:r>
+      <w:r>
+        <w:rPr>
+          <w:b/>
+          <w:bCs/>
+          <w:lang w:val="en-US"/>
+        </w:rPr>
+        <w:t>client side:</w:t>
+      </w:r>
+      <w:r>
+        <w:rPr>
+          <w:lang w:val="en-US"/>
+        </w:rPr>
+        <w:t xml:space="preserve"> </w:t>
+      </w:r>
+    </w:p>
+    <w:p>
+      <w:pPr>
+        <w:rPr>
+          <w:highlight w:val="green"/>
+          <w:lang w:val="en-US"/>
+        </w:rPr>
+      </w:pPr>
+      <w:r>
+        <w:rPr>
+          <w:highlight w:val="green"/>
+          <w:lang w:val="en-US"/>
+        </w:rPr>
+        <w:t>create Login page - after login continue to dashboard</w:t>
+      </w:r>
+    </w:p>
+    <w:p>
+      <w:pPr>
+        <w:rPr>
+          <w:lang w:val="en-US"/>
+        </w:rPr>
+      </w:pPr>
+      <w:r>
+        <w:rPr>
+          <w:highlight w:val="green"/>
+          <w:lang w:val="en-US"/>
+        </w:rPr>
+        <w:t>create Register page - after register continue to login</w:t>
+      </w:r>
+    </w:p>
+    <w:p>
+      <w:pPr>
+        <w:pBdr>
+          <w:bottom w:val="single" w:sz="6" w:space="1" w:color="auto"/>
+        </w:pBdr>
+        <w:rPr>
+          <w:rtl/>
+          <w:lang w:val="en-US"/>
+        </w:rPr>
+      </w:pPr>
+    </w:p>
+    <w:p>
+      <w:pPr>
+        <w:rPr>
+          <w:rtl/>
+          <w:lang w:val="en-US"/>
+        </w:rPr>
+      </w:pPr>
+    </w:p>
+    <w:p>
+      <w:pPr>
+        <w:bidi/>
+        <w:rPr>
+          <w:b/>
+          <w:bCs/>
+          <w:rtl/>
+        </w:rPr>
+      </w:pPr>
+      <w:r>
         <w:rPr>
           <w:rFonts w:hint="cs"/>
-          <w:rtl/>
-        </w:rPr>
-      </w:pPr>
-    </w:p>
-    <w:p>
-      <w:pPr>
-        <w:rPr>
-          <w:lang w:val="en-US"/>
-        </w:rPr>
-      </w:pPr>
-      <w:r>
-        <w:rPr>
-          <w:lang w:val="en-US"/>
-        </w:rPr>
-        <w:t>2.</w:t>
-      </w:r>
-      <w:r>
-        <w:rPr>
-          <w:b/>
-          <w:bCs/>
-          <w:lang w:val="en-US"/>
-        </w:rPr>
-        <w:t>server side:</w:t>
-      </w:r>
-      <w:r>
-        <w:rPr>
-          <w:lang w:val="en-US"/>
-        </w:rPr>
-        <w:t xml:space="preserve"> </w:t>
-      </w:r>
-    </w:p>
-    <w:p>
-      <w:pPr>
-        <w:rPr>
-          <w:rtl/>
-          <w:lang w:val="en-US"/>
-        </w:rPr>
-      </w:pPr>
-      <w:r>
-        <w:rPr>
-          <w:lang w:val="en-US"/>
-        </w:rPr>
-        <w:t xml:space="preserve">routes: </w:t>
-      </w:r>
-    </w:p>
-    <w:p>
-      <w:pPr>
-        <w:rPr>
-          <w:rtl/>
-          <w:lang w:val="en-US"/>
-        </w:rPr>
-      </w:pPr>
-      <w:r>
-        <w:rPr>
-          <w:lang w:val="en-US"/>
-        </w:rPr>
-        <w:t>register function (</w:t>
-      </w:r>
-      <w:r>
-        <w:rPr>
-          <w:lang w:val="en-US"/>
-        </w:rPr>
-        <w:t xml:space="preserve">save </w:t>
-      </w:r>
-      <w:r>
-        <w:rPr>
-          <w:lang w:val="en-US"/>
-        </w:rPr>
-        <w:t xml:space="preserve">with encryption) </w:t>
-      </w:r>
-    </w:p>
-    <w:p>
-      <w:pPr>
-        <w:rPr>
-          <w:lang w:val="en-US"/>
-        </w:rPr>
-      </w:pPr>
-      <w:r>
-        <w:rPr>
-          <w:lang w:val="en-US"/>
-        </w:rPr>
-        <w:t>login function (checks db if exists + check password)</w:t>
-      </w:r>
-    </w:p>
-    <w:p>
-      <w:pPr>
-        <w:rPr>
-          <w:lang w:val="en-US"/>
-        </w:rPr>
-      </w:pPr>
-    </w:p>
-    <w:p>
-      <w:pPr>
-        <w:rPr>
-          <w:lang w:val="en-US"/>
-        </w:rPr>
-      </w:pPr>
-      <w:r>
-        <w:rPr>
-          <w:lang w:val="en-US"/>
-        </w:rPr>
-        <w:t>3.</w:t>
-      </w:r>
-      <w:r>
-        <w:rPr>
-          <w:b/>
-          <w:bCs/>
-          <w:lang w:val="en-US"/>
-        </w:rPr>
-        <w:t>client side:</w:t>
-      </w:r>
-      <w:r>
-        <w:rPr>
-          <w:lang w:val="en-US"/>
-        </w:rPr>
-        <w:t xml:space="preserve"> </w:t>
-      </w:r>
-    </w:p>
-    <w:p>
-      <w:pPr>
-        <w:rPr>
-          <w:highlight w:val="green"/>
-          <w:lang w:val="en-US"/>
-        </w:rPr>
-      </w:pPr>
-      <w:r>
-        <w:rPr>
-          <w:highlight w:val="green"/>
-          <w:lang w:val="en-US"/>
-        </w:rPr>
-        <w:t>create Login page - after login continue to dashboard</w:t>
-      </w:r>
-    </w:p>
-    <w:p>
-      <w:pPr>
-        <w:rPr>
-          <w:lang w:val="en-US"/>
-        </w:rPr>
-      </w:pPr>
-      <w:r>
-        <w:rPr>
-          <w:highlight w:val="green"/>
-          <w:lang w:val="en-US"/>
-        </w:rPr>
-        <w:t>create Register page - after register continue to login</w:t>
-      </w:r>
-    </w:p>
-    <w:p>
-      <w:pPr>
-        <w:rPr>
-          <w:rtl/>
-          <w:lang w:val="en-US"/>
-        </w:rPr>
-      </w:pPr>
-      <w:r>
-        <w:rPr>
-          <w:lang w:val="en-US"/>
-        </w:rPr>
-        <w:t>create Dashboard page</w:t>
-      </w:r>
-    </w:p>
-    <w:p>
-      <w:pPr>
-        <w:rPr>
-          <w:rtl/>
-          <w:lang w:val="en-US"/>
-        </w:rPr>
-      </w:pPr>
-    </w:p>
-    <w:p>
-      <w:pPr>
-        <w:rPr>
-          <w:rtl/>
-          <w:lang w:val="ru-RU"/>
-        </w:rPr>
-      </w:pPr>
-    </w:p>
+          <w:b/>
+          <w:bCs/>
+          <w:rtl/>
+        </w:rPr>
+        <w:t xml:space="preserve">שלב </w:t>
+      </w:r>
+      <w:r>
+        <w:rPr>
+          <w:rFonts w:hint="cs"/>
+          <w:b/>
+          <w:bCs/>
+          <w:rtl/>
+        </w:rPr>
+        <w:t>ג</w:t>
+      </w:r>
+      <w:r>
+        <w:rPr>
+          <w:rFonts w:hint="cs"/>
+          <w:b/>
+          <w:bCs/>
+          <w:rtl/>
+        </w:rPr>
+        <w:t xml:space="preserve">- </w:t>
+      </w:r>
+      <w:r>
+        <w:rPr>
+          <w:rFonts w:hint="cs"/>
+          <w:b/>
+          <w:bCs/>
+          <w:rtl/>
+        </w:rPr>
+        <w:t>המשך</w:t>
+      </w:r>
+      <w:r>
+        <w:rPr>
+          <w:rFonts w:hint="cs"/>
+          <w:b/>
+          <w:bCs/>
+          <w:rtl/>
+        </w:rPr>
+        <w:t xml:space="preserve">: </w:t>
+      </w:r>
+    </w:p>
+    <w:p>
+      <w:pPr>
+        <w:rPr>
+          <w:u w:val="single"/>
+        </w:rPr>
+      </w:pPr>
+      <w:r>
+        <w:rPr>
+          <w:u w:val="single"/>
+        </w:rPr>
+        <w:t>Client:</w:t>
+      </w:r>
+    </w:p>
+    <w:p>
+      <w:r>
+        <w:t>create sidebar</w:t>
+      </w:r>
+    </w:p>
+    <w:p>
+      <w:r>
+        <w:t>create task card</w:t>
+      </w:r>
+    </w:p>
+    <w:p>
+      <w:r>
+        <w:t xml:space="preserve">create dashboard page </w:t>
+      </w:r>
+    </w:p>
+    <w:p>
+      <w:pPr>
+        <w:rPr>
+          <w:u w:val="single"/>
+        </w:rPr>
+      </w:pPr>
+      <w:r>
+        <w:rPr>
+          <w:u w:val="single"/>
+        </w:rPr>
+        <w:t>Server:</w:t>
+      </w:r>
+    </w:p>
+    <w:p>
+      <w:r>
+        <w:t xml:space="preserve">Create task route : add task, edit task and get all tasks/ by category </w:t>
+      </w:r>
+    </w:p>
+    <w:p/>
+    <w:p/>
     <w:sectPr>
       <w:pgSz w:w="11906" w:h="16838"/>
       <w:pgMar w:top="1440" w:right="1440" w:bottom="1440" w:left="1440" w:header="708" w:footer="708" w:gutter="0"/>

</xml_diff>

<commit_message>
add dashborad page and add task component
</commit_message>
<xml_diff>
--- a/TDL.docx
+++ b/TDL.docx
@@ -1408,7 +1408,7 @@
           <w:bCs/>
           <w:rtl/>
         </w:rPr>
-        <w:t>ג</w:t>
+        <w:t>ג- המשך</w:t>
       </w:r>
       <w:r>
         <w:rPr>
@@ -1417,35 +1417,21 @@
           <w:bCs/>
           <w:rtl/>
         </w:rPr>
-        <w:t xml:space="preserve">- </w:t>
-      </w:r>
-      <w:r>
-        <w:rPr>
-          <w:rFonts w:hint="cs"/>
-          <w:b/>
-          <w:bCs/>
-          <w:rtl/>
-        </w:rPr>
-        <w:t>המשך</w:t>
-      </w:r>
-      <w:r>
-        <w:rPr>
-          <w:rFonts w:hint="cs"/>
-          <w:b/>
-          <w:bCs/>
-          <w:rtl/>
-        </w:rPr>
         <w:t xml:space="preserve">: </w:t>
       </w:r>
     </w:p>
     <w:p>
       <w:pPr>
         <w:rPr>
+          <w:b/>
+          <w:bCs/>
           <w:u w:val="single"/>
         </w:rPr>
       </w:pPr>
       <w:r>
         <w:rPr>
+          <w:b/>
+          <w:bCs/>
           <w:u w:val="single"/>
         </w:rPr>
         <w:t>Client:</w:t>
@@ -1458,22 +1444,48 @@
     </w:p>
     <w:p>
       <w:r>
+        <w:rPr>
+          <w:highlight w:val="green"/>
+        </w:rPr>
         <w:t>create task card</w:t>
       </w:r>
     </w:p>
     <w:p>
       <w:r>
-        <w:t xml:space="preserve">create dashboard page </w:t>
-      </w:r>
-    </w:p>
-    <w:p>
-      <w:pPr>
-        <w:rPr>
+        <w:rPr>
+          <w:highlight w:val="green"/>
+        </w:rPr>
+        <w:t>create dashboard page</w:t>
+      </w:r>
+      <w:r>
+        <w:t xml:space="preserve"> </w:t>
+      </w:r>
+    </w:p>
+    <w:p>
+      <w:r>
+        <w:rPr>
+          <w:highlight w:val="green"/>
+        </w:rPr>
+        <w:t>sort tasks by date</w:t>
+      </w:r>
+    </w:p>
+    <w:p>
+      <w:r>
+        <w:t>sort tasks by subject</w:t>
+      </w:r>
+    </w:p>
+    <w:p>
+      <w:pPr>
+        <w:rPr>
+          <w:b/>
+          <w:bCs/>
           <w:u w:val="single"/>
         </w:rPr>
       </w:pPr>
       <w:r>
         <w:rPr>
+          <w:b/>
+          <w:bCs/>
           <w:u w:val="single"/>
         </w:rPr>
         <w:t>Server:</w:t>
@@ -1481,9 +1493,16 @@
     </w:p>
     <w:p>
       <w:r>
-        <w:t xml:space="preserve">Create task route : add task, edit task and get all tasks/ by category </w:t>
-      </w:r>
-    </w:p>
+        <w:rPr>
+          <w:highlight w:val="green"/>
+        </w:rPr>
+        <w:t>Create task route : add task, edit task and get all tasks</w:t>
+      </w:r>
+      <w:r>
+        <w:t xml:space="preserve"> </w:t>
+      </w:r>
+    </w:p>
+    <w:p/>
     <w:p/>
     <w:p/>
     <w:sectPr>

</xml_diff>

<commit_message>
add red tasks when overdue, and add navigation to dashboard when user is already logged in.
</commit_message>
<xml_diff>
--- a/TDL.docx
+++ b/TDL.docx
@@ -552,7 +552,29 @@
           <w:lang w:val="ru-RU"/>
         </w:rPr>
         <w:lastRenderedPageBreak/>
-        <w:t xml:space="preserve">שלב א: הגדרות </w:t>
+        <w:t xml:space="preserve">שלב </w:t>
+      </w:r>
+      <w:r>
+        <w:rPr>
+          <w:rFonts w:hint="cs"/>
+          <w:b/>
+          <w:bCs/>
+          <w:u w:val="single"/>
+          <w:rtl/>
+          <w:lang w:val="ru-RU"/>
+        </w:rPr>
+        <w:t>1</w:t>
+      </w:r>
+      <w:r>
+        <w:rPr>
+          <w:rFonts w:hint="cs"/>
+          <w:b/>
+          <w:bCs/>
+          <w:u w:val="single"/>
+          <w:rtl/>
+          <w:lang w:val="ru-RU"/>
+        </w:rPr>
+        <w:t xml:space="preserve">: הגדרות </w:t>
       </w:r>
     </w:p>
     <w:p>
@@ -1134,7 +1156,16 @@
           <w:bCs/>
           <w:rtl/>
         </w:rPr>
-        <w:t>שלב ב</w:t>
+        <w:t xml:space="preserve">שלב </w:t>
+      </w:r>
+      <w:r>
+        <w:rPr>
+          <w:rFonts w:hint="cs"/>
+          <w:b/>
+          <w:bCs/>
+          <w:rtl/>
+        </w:rPr>
+        <w:t>2</w:t>
       </w:r>
       <w:r>
         <w:rPr>
@@ -1408,7 +1439,7 @@
           <w:bCs/>
           <w:rtl/>
         </w:rPr>
-        <w:t>ג- המשך</w:t>
+        <w:t>3</w:t>
       </w:r>
       <w:r>
         <w:rPr>
@@ -1417,6 +1448,15 @@
           <w:bCs/>
           <w:rtl/>
         </w:rPr>
+        <w:t>- המשך</w:t>
+      </w:r>
+      <w:r>
+        <w:rPr>
+          <w:rFonts w:hint="cs"/>
+          <w:b/>
+          <w:bCs/>
+          <w:rtl/>
+        </w:rPr>
         <w:t xml:space="preserve">: </w:t>
       </w:r>
     </w:p>
@@ -1439,42 +1479,154 @@
     </w:p>
     <w:p>
       <w:r>
+        <w:rPr>
+          <w:highlight w:val="green"/>
+        </w:rPr>
+        <w:t>create task card</w:t>
+      </w:r>
+    </w:p>
+    <w:p>
+      <w:r>
+        <w:rPr>
+          <w:highlight w:val="green"/>
+        </w:rPr>
+        <w:t>create dashboard page</w:t>
+      </w:r>
+      <w:r>
+        <w:t xml:space="preserve"> </w:t>
+      </w:r>
+    </w:p>
+    <w:p>
+      <w:r>
+        <w:rPr>
+          <w:highlight w:val="green"/>
+        </w:rPr>
+        <w:t>sort tasks by date</w:t>
+      </w:r>
+    </w:p>
+    <w:p>
+      <w:pPr>
+        <w:rPr>
+          <w:b/>
+          <w:bCs/>
+          <w:u w:val="single"/>
+        </w:rPr>
+      </w:pPr>
+      <w:r>
+        <w:rPr>
+          <w:b/>
+          <w:bCs/>
+          <w:u w:val="single"/>
+        </w:rPr>
+        <w:t>Server:</w:t>
+      </w:r>
+    </w:p>
+    <w:p>
+      <w:r>
+        <w:rPr>
+          <w:highlight w:val="green"/>
+        </w:rPr>
+        <w:t>Create task route : add task, edit task and get all tasks</w:t>
+      </w:r>
+      <w:r>
+        <w:t xml:space="preserve"> </w:t>
+      </w:r>
+    </w:p>
+    <w:p>
+      <w:pPr>
+        <w:pBdr>
+          <w:bottom w:val="single" w:sz="6" w:space="1" w:color="auto"/>
+        </w:pBdr>
+        <w:rPr>
+          <w:rtl/>
+          <w:lang w:val="en-US"/>
+        </w:rPr>
+      </w:pPr>
+    </w:p>
+    <w:p>
+      <w:pPr>
+        <w:rPr>
+          <w:rtl/>
+          <w:lang w:val="en-US"/>
+        </w:rPr>
+      </w:pPr>
+    </w:p>
+    <w:p>
+      <w:pPr>
+        <w:bidi/>
+        <w:rPr>
+          <w:b/>
+          <w:bCs/>
+          <w:u w:val="single"/>
+          <w:rtl/>
+        </w:rPr>
+      </w:pPr>
+      <w:r>
+        <w:rPr>
+          <w:rFonts w:hint="cs"/>
+          <w:b/>
+          <w:bCs/>
+          <w:u w:val="single"/>
+          <w:rtl/>
+        </w:rPr>
+        <w:lastRenderedPageBreak/>
+        <w:t xml:space="preserve">שלב 4- המשך: </w:t>
+      </w:r>
+    </w:p>
+    <w:p>
+      <w:pPr>
+        <w:rPr>
+          <w:rtl/>
+          <w:lang w:val="ru-RU"/>
+        </w:rPr>
+      </w:pPr>
+    </w:p>
+    <w:p>
+      <w:pPr>
+        <w:rPr>
+          <w:b/>
+          <w:bCs/>
+          <w:u w:val="single"/>
+        </w:rPr>
+      </w:pPr>
+      <w:r>
+        <w:rPr>
+          <w:b/>
+          <w:bCs/>
+          <w:u w:val="single"/>
+        </w:rPr>
+        <w:t>Client:</w:t>
+      </w:r>
+    </w:p>
+    <w:p>
+      <w:r>
         <w:t>create sidebar</w:t>
       </w:r>
     </w:p>
     <w:p>
       <w:r>
-        <w:rPr>
-          <w:highlight w:val="green"/>
-        </w:rPr>
-        <w:t>create task card</w:t>
-      </w:r>
-    </w:p>
-    <w:p>
-      <w:r>
-        <w:rPr>
-          <w:highlight w:val="green"/>
-        </w:rPr>
-        <w:t>create dashboard page</w:t>
-      </w:r>
-      <w:r>
-        <w:t xml:space="preserve"> </w:t>
-      </w:r>
-    </w:p>
-    <w:p>
-      <w:r>
-        <w:rPr>
-          <w:highlight w:val="green"/>
-        </w:rPr>
-        <w:t>sort tasks by date</w:t>
-      </w:r>
-    </w:p>
-    <w:p>
-      <w:r>
         <w:t>sort tasks by subject</w:t>
       </w:r>
     </w:p>
     <w:p>
+      <w:r>
+        <w:t>create profile page</w:t>
+      </w:r>
+    </w:p>
+    <w:p>
+      <w:r>
+        <w:rPr>
+          <w:highlight w:val="green"/>
+        </w:rPr>
+        <w:t>red task when time out</w:t>
+      </w:r>
+    </w:p>
+    <w:p>
+      <w:r>
+        <w:t xml:space="preserve">logo+ site name </w:t>
+      </w:r>
+    </w:p>
+    <w:p>
       <w:pPr>
         <w:rPr>
           <w:b/>
@@ -1491,18 +1643,6 @@
         <w:t>Server:</w:t>
       </w:r>
     </w:p>
-    <w:p>
-      <w:r>
-        <w:rPr>
-          <w:highlight w:val="green"/>
-        </w:rPr>
-        <w:t>Create task route : add task, edit task and get all tasks</w:t>
-      </w:r>
-      <w:r>
-        <w:t xml:space="preserve"> </w:t>
-      </w:r>
-    </w:p>
-    <w:p/>
     <w:p/>
     <w:p/>
     <w:sectPr>

</xml_diff>

<commit_message>
add sort by categories
</commit_message>
<xml_diff>
--- a/TDL.docx
+++ b/TDL.docx
@@ -1605,7 +1605,16 @@
     </w:p>
     <w:p>
       <w:r>
-        <w:t>sort tasks by subject</w:t>
+        <w:rPr>
+          <w:highlight w:val="green"/>
+        </w:rPr>
+        <w:t xml:space="preserve">sort tasks by </w:t>
+      </w:r>
+      <w:r>
+        <w:rPr>
+          <w:highlight w:val="green"/>
+        </w:rPr>
+        <w:t>categories</w:t>
       </w:r>
     </w:p>
     <w:p>
@@ -1623,7 +1632,13 @@
     </w:p>
     <w:p>
       <w:r>
-        <w:t xml:space="preserve">logo+ site name </w:t>
+        <w:rPr>
+          <w:highlight w:val="green"/>
+        </w:rPr>
+        <w:t>logo+ site name</w:t>
+      </w:r>
+      <w:r>
+        <w:t xml:space="preserve"> </w:t>
       </w:r>
     </w:p>
     <w:p>

</xml_diff>

<commit_message>
add profile page with user info and edit functionality + graphical information about tasks progress
</commit_message>
<xml_diff>
--- a/TDL.docx
+++ b/TDL.docx
@@ -1600,11 +1600,6 @@
     </w:p>
     <w:p>
       <w:r>
-        <w:t>create sidebar</w:t>
-      </w:r>
-    </w:p>
-    <w:p>
-      <w:r>
         <w:rPr>
           <w:highlight w:val="green"/>
         </w:rPr>
@@ -1619,6 +1614,9 @@
     </w:p>
     <w:p>
       <w:r>
+        <w:rPr>
+          <w:highlight w:val="green"/>
+        </w:rPr>
         <w:t>create profile page</w:t>
       </w:r>
     </w:p>

</xml_diff>